<commit_message>
Update README Cyber Project Overview
</commit_message>
<xml_diff>
--- a/Finding Malicious Malware Thru CMD.docx
+++ b/Finding Malicious Malware Thru CMD.docx
@@ -21,16 +21,76 @@
           <w:highlight w:val="yellow"/>
           <w:u w:val="single"/>
         </w:rPr>
-        <w:t>Issue computer froze and then while I was restarting it, it started updating automatically, I believe it was malware:</w:t>
-      </w:r>
-      <w:r>
-        <w:rPr>
-          <w:b/>
-          <w:bCs/>
-          <w:sz w:val="36"/>
-          <w:szCs w:val="36"/>
-          <w:u w:val="single"/>
-        </w:rPr>
+        <w:t>Running A complete Anti-Virus Scan through Windows Command Prompt:</w:t>
+      </w:r>
+    </w:p>
+    <w:p>
+      <w:pPr>
+        <w:pStyle w:val="ListParagraph"/>
+        <w:numPr>
+          <w:ilvl w:val="0"/>
+          <w:numId w:val="2"/>
+        </w:numPr>
+        <w:rPr>
+          <w:b/>
+          <w:bCs/>
+          <w:sz w:val="32"/>
+          <w:szCs w:val="32"/>
+          <w:highlight w:val="cyan"/>
+        </w:rPr>
+      </w:pPr>
+      <w:r>
+        <w:rPr>
+          <w:b/>
+          <w:bCs/>
+          <w:sz w:val="32"/>
+          <w:szCs w:val="32"/>
+          <w:highlight w:val="cyan"/>
+        </w:rPr>
+        <w:t>To access the correct directory and stat the full scan:</w:t>
+      </w:r>
+    </w:p>
+    <w:p>
+      <w:pPr>
+        <w:pStyle w:val="ListParagraph"/>
+        <w:numPr>
+          <w:ilvl w:val="1"/>
+          <w:numId w:val="2"/>
+        </w:numPr>
+      </w:pPr>
+      <w:r>
+        <w:t xml:space="preserve">Type, </w:t>
+      </w:r>
+      <w:r>
+        <w:rPr>
+          <w:b/>
+          <w:bCs/>
+          <w:i/>
+          <w:iCs/>
+        </w:rPr>
+        <w:t>cd “C:\</w:t>
+      </w:r>
+      <w:proofErr w:type="spellStart"/>
+      <w:r>
+        <w:rPr>
+          <w:b/>
+          <w:bCs/>
+          <w:i/>
+          <w:iCs/>
+        </w:rPr>
+        <w:t>ProgramData</w:t>
+      </w:r>
+      <w:proofErr w:type="spellEnd"/>
+      <w:r>
+        <w:rPr>
+          <w:b/>
+          <w:bCs/>
+          <w:i/>
+          <w:iCs/>
+        </w:rPr>
+        <w:t>\Microsoft\Windows Defender\Platform”</w:t>
+      </w:r>
+      <w:r>
         <w:t xml:space="preserve"> </w:t>
       </w:r>
     </w:p>
@@ -38,12 +98,352 @@
       <w:pPr>
         <w:pStyle w:val="ListParagraph"/>
         <w:numPr>
+          <w:ilvl w:val="2"/>
+          <w:numId w:val="2"/>
+        </w:numPr>
+      </w:pPr>
+      <w:r>
+        <w:t xml:space="preserve">Type, </w:t>
+      </w:r>
+      <w:r>
+        <w:rPr>
+          <w:b/>
+          <w:bCs/>
+          <w:i/>
+          <w:iCs/>
+        </w:rPr>
+        <w:t>for /f “</w:t>
+      </w:r>
+      <w:proofErr w:type="spellStart"/>
+      <w:r>
+        <w:rPr>
+          <w:b/>
+          <w:bCs/>
+          <w:i/>
+          <w:iCs/>
+        </w:rPr>
+        <w:t>delims</w:t>
+      </w:r>
+      <w:proofErr w:type="spellEnd"/>
+      <w:r>
+        <w:rPr>
+          <w:b/>
+          <w:bCs/>
+          <w:i/>
+          <w:iCs/>
+        </w:rPr>
+        <w:t>=” %</w:t>
+      </w:r>
+      <w:proofErr w:type="spellStart"/>
+      <w:r>
+        <w:rPr>
+          <w:b/>
+          <w:bCs/>
+          <w:i/>
+          <w:iCs/>
+        </w:rPr>
+        <w:t>i</w:t>
+      </w:r>
+      <w:proofErr w:type="spellEnd"/>
+      <w:r>
+        <w:rPr>
+          <w:b/>
+          <w:bCs/>
+          <w:i/>
+          <w:iCs/>
+        </w:rPr>
+        <w:t xml:space="preserve"> in (‘dir /b /ad /o-n’) do cd “%</w:t>
+      </w:r>
+      <w:proofErr w:type="spellStart"/>
+      <w:r>
+        <w:rPr>
+          <w:b/>
+          <w:bCs/>
+          <w:i/>
+          <w:iCs/>
+        </w:rPr>
+        <w:t>i</w:t>
+      </w:r>
+      <w:proofErr w:type="spellEnd"/>
+      <w:r>
+        <w:rPr>
+          <w:b/>
+          <w:bCs/>
+          <w:i/>
+          <w:iCs/>
+        </w:rPr>
+        <w:t>”</w:t>
+      </w:r>
+      <w:r>
+        <w:t xml:space="preserve"> </w:t>
+      </w:r>
+    </w:p>
+    <w:p>
+      <w:pPr>
+        <w:pStyle w:val="ListParagraph"/>
+        <w:numPr>
+          <w:ilvl w:val="2"/>
+          <w:numId w:val="2"/>
+        </w:numPr>
+      </w:pPr>
+      <w:r>
+        <w:t xml:space="preserve">Then type, </w:t>
+      </w:r>
+      <w:r>
+        <w:rPr>
+          <w:b/>
+          <w:bCs/>
+          <w:i/>
+          <w:iCs/>
+        </w:rPr>
+        <w:t>MyCmdRun.exe -Scan -</w:t>
+      </w:r>
+      <w:proofErr w:type="spellStart"/>
+      <w:r>
+        <w:rPr>
+          <w:b/>
+          <w:bCs/>
+          <w:i/>
+          <w:iCs/>
+        </w:rPr>
+        <w:t>ScanType</w:t>
+      </w:r>
+      <w:proofErr w:type="spellEnd"/>
+      <w:r>
+        <w:rPr>
+          <w:b/>
+          <w:bCs/>
+          <w:i/>
+          <w:iCs/>
+        </w:rPr>
+        <w:t xml:space="preserve"> 2, </w:t>
+      </w:r>
+      <w:r>
+        <w:t>this runs the full scan.</w:t>
+      </w:r>
+      <w:r>
+        <w:t xml:space="preserve"> </w:t>
+      </w:r>
+    </w:p>
+    <w:p>
+      <w:pPr>
+        <w:pStyle w:val="ListParagraph"/>
+        <w:numPr>
+          <w:ilvl w:val="1"/>
+          <w:numId w:val="2"/>
+        </w:numPr>
+      </w:pPr>
+      <w:r>
+        <w:t xml:space="preserve">Type, </w:t>
+      </w:r>
+      <w:r>
+        <w:rPr>
+          <w:b/>
+          <w:bCs/>
+          <w:i/>
+          <w:iCs/>
+        </w:rPr>
+        <w:t>MyCmdRun.exe -Scan -</w:t>
+      </w:r>
+      <w:proofErr w:type="spellStart"/>
+      <w:r>
+        <w:rPr>
+          <w:b/>
+          <w:bCs/>
+          <w:i/>
+          <w:iCs/>
+        </w:rPr>
+        <w:t>ScanType</w:t>
+      </w:r>
+      <w:proofErr w:type="spellEnd"/>
+      <w:r>
+        <w:rPr>
+          <w:b/>
+          <w:bCs/>
+          <w:i/>
+          <w:iCs/>
+        </w:rPr>
+        <w:t xml:space="preserve"> 2 </w:t>
+      </w:r>
+      <w:r>
+        <w:t>or run type 1, type 3</w:t>
+      </w:r>
+      <w:r>
+        <w:t xml:space="preserve"> </w:t>
+      </w:r>
+    </w:p>
+    <w:p>
+      <w:pPr>
+        <w:pStyle w:val="ListParagraph"/>
+        <w:numPr>
+          <w:ilvl w:val="2"/>
+          <w:numId w:val="2"/>
+        </w:numPr>
+      </w:pPr>
+      <w:r>
+        <w:t xml:space="preserve">Type 3: Scan specific folders: Type, </w:t>
+      </w:r>
+      <w:r>
+        <w:rPr>
+          <w:b/>
+          <w:bCs/>
+          <w:i/>
+          <w:iCs/>
+        </w:rPr>
+        <w:t>MyCmdRun.exe -Scan -</w:t>
+      </w:r>
+      <w:proofErr w:type="spellStart"/>
+      <w:r>
+        <w:rPr>
+          <w:b/>
+          <w:bCs/>
+          <w:i/>
+          <w:iCs/>
+        </w:rPr>
+        <w:t>ScanType</w:t>
+      </w:r>
+      <w:proofErr w:type="spellEnd"/>
+      <w:r>
+        <w:rPr>
+          <w:b/>
+          <w:bCs/>
+          <w:i/>
+          <w:iCs/>
+        </w:rPr>
+        <w:t xml:space="preserve"> 3 -File “C:\Path\To\Folder” </w:t>
+      </w:r>
+    </w:p>
+    <w:p>
+      <w:pPr>
+        <w:pStyle w:val="ListParagraph"/>
+        <w:numPr>
+          <w:ilvl w:val="1"/>
+          <w:numId w:val="2"/>
+        </w:numPr>
+        <w:rPr>
+          <w:b/>
+          <w:bCs/>
+          <w:i/>
+          <w:iCs/>
+        </w:rPr>
+      </w:pPr>
+      <w:r>
+        <w:t xml:space="preserve">Type for one-liner version, </w:t>
+      </w:r>
+      <w:r>
+        <w:rPr>
+          <w:b/>
+          <w:bCs/>
+          <w:i/>
+          <w:iCs/>
+        </w:rPr>
+        <w:t>cd /d "C:\ProgramData\Microsoft\Windows Defender\Platform" &amp;&amp; for /f "</w:t>
+      </w:r>
+      <w:proofErr w:type="spellStart"/>
+      <w:r>
+        <w:rPr>
+          <w:b/>
+          <w:bCs/>
+          <w:i/>
+          <w:iCs/>
+        </w:rPr>
+        <w:t>delims</w:t>
+      </w:r>
+      <w:proofErr w:type="spellEnd"/>
+      <w:r>
+        <w:rPr>
+          <w:b/>
+          <w:bCs/>
+          <w:i/>
+          <w:iCs/>
+        </w:rPr>
+        <w:t>=" %</w:t>
+      </w:r>
+      <w:proofErr w:type="spellStart"/>
+      <w:r>
+        <w:rPr>
+          <w:b/>
+          <w:bCs/>
+          <w:i/>
+          <w:iCs/>
+        </w:rPr>
+        <w:t>i</w:t>
+      </w:r>
+      <w:proofErr w:type="spellEnd"/>
+      <w:r>
+        <w:rPr>
+          <w:b/>
+          <w:bCs/>
+          <w:i/>
+          <w:iCs/>
+        </w:rPr>
+        <w:t xml:space="preserve"> in ('dir /b /ad /o-n') do @cd /d "%</w:t>
+      </w:r>
+      <w:proofErr w:type="spellStart"/>
+      <w:r>
+        <w:rPr>
+          <w:b/>
+          <w:bCs/>
+          <w:i/>
+          <w:iCs/>
+        </w:rPr>
+        <w:t>i</w:t>
+      </w:r>
+      <w:proofErr w:type="spellEnd"/>
+      <w:r>
+        <w:rPr>
+          <w:b/>
+          <w:bCs/>
+          <w:i/>
+          <w:iCs/>
+        </w:rPr>
+        <w:t>" &amp;&amp; MpCmdRun.exe -Scan -</w:t>
+      </w:r>
+      <w:proofErr w:type="spellStart"/>
+      <w:r>
+        <w:rPr>
+          <w:b/>
+          <w:bCs/>
+          <w:i/>
+          <w:iCs/>
+        </w:rPr>
+        <w:t>ScanType</w:t>
+      </w:r>
+      <w:proofErr w:type="spellEnd"/>
+      <w:r>
+        <w:rPr>
+          <w:b/>
+          <w:bCs/>
+          <w:i/>
+          <w:iCs/>
+        </w:rPr>
+        <w:t xml:space="preserve"> 2</w:t>
+      </w:r>
+    </w:p>
+    <w:p>
+      <w:pPr>
+        <w:pStyle w:val="ListParagraph"/>
+        <w:numPr>
           <w:ilvl w:val="0"/>
-          <w:numId w:val="1"/>
-        </w:numPr>
-      </w:pPr>
-      <w:r>
-        <w:t xml:space="preserve">It is possible that malware can disguise itself as windows updates-sometimes referred to as fake updates ransomware- it is also common for windows to trigger updates after a system freeze or crash. </w:t>
+          <w:numId w:val="2"/>
+        </w:numPr>
+        <w:rPr>
+          <w:b/>
+          <w:bCs/>
+          <w:sz w:val="32"/>
+          <w:szCs w:val="32"/>
+          <w:highlight w:val="cyan"/>
+        </w:rPr>
+      </w:pPr>
+      <w:r>
+        <w:rPr>
+          <w:b/>
+          <w:bCs/>
+          <w:sz w:val="32"/>
+          <w:szCs w:val="32"/>
+          <w:highlight w:val="cyan"/>
+        </w:rPr>
+        <w:t>To update Definitions:</w:t>
       </w:r>
     </w:p>
     <w:p>
@@ -51,8 +451,140 @@
         <w:pStyle w:val="ListParagraph"/>
         <w:numPr>
           <w:ilvl w:val="1"/>
-          <w:numId w:val="1"/>
-        </w:numPr>
+          <w:numId w:val="2"/>
+        </w:numPr>
+      </w:pPr>
+      <w:r>
+        <w:t>MyCmdRun.exe -</w:t>
+      </w:r>
+      <w:proofErr w:type="spellStart"/>
+      <w:r>
+        <w:t>SignatureUpdate</w:t>
+      </w:r>
+      <w:proofErr w:type="spellEnd"/>
+    </w:p>
+    <w:p>
+      <w:pPr>
+        <w:pStyle w:val="ListParagraph"/>
+        <w:numPr>
+          <w:ilvl w:val="0"/>
+          <w:numId w:val="2"/>
+        </w:numPr>
+        <w:rPr>
+          <w:b/>
+          <w:bCs/>
+          <w:sz w:val="32"/>
+          <w:szCs w:val="32"/>
+          <w:highlight w:val="cyan"/>
+        </w:rPr>
+      </w:pPr>
+      <w:r>
+        <w:rPr>
+          <w:b/>
+          <w:bCs/>
+          <w:sz w:val="32"/>
+          <w:szCs w:val="32"/>
+          <w:highlight w:val="cyan"/>
+        </w:rPr>
+        <w:t>To list Quarantined Items:</w:t>
+      </w:r>
+    </w:p>
+    <w:p>
+      <w:pPr>
+        <w:pStyle w:val="ListParagraph"/>
+        <w:numPr>
+          <w:ilvl w:val="1"/>
+          <w:numId w:val="2"/>
+        </w:numPr>
+      </w:pPr>
+      <w:r>
+        <w:t>MyCmdRun.exe -Restore -</w:t>
+      </w:r>
+      <w:proofErr w:type="spellStart"/>
+      <w:r>
+        <w:t>ListAll</w:t>
+      </w:r>
+      <w:proofErr w:type="spellEnd"/>
+      <w:r>
+        <w:t xml:space="preserve"> </w:t>
+      </w:r>
+    </w:p>
+    <w:p>
+      <w:pPr>
+        <w:pStyle w:val="ListParagraph"/>
+        <w:numPr>
+          <w:ilvl w:val="0"/>
+          <w:numId w:val="2"/>
+        </w:numPr>
+      </w:pPr>
+      <w:r>
+        <w:rPr>
+          <w:b/>
+          <w:bCs/>
+          <w:color w:val="EE0000"/>
+        </w:rPr>
+        <w:t>Note</w:t>
+      </w:r>
+      <w:r>
+        <w:t xml:space="preserve">: System32 contains general Windows tools, but Defender lived in </w:t>
+      </w:r>
+      <w:proofErr w:type="spellStart"/>
+      <w:r>
+        <w:t>ProgramData</w:t>
+      </w:r>
+      <w:proofErr w:type="spellEnd"/>
+    </w:p>
+    <w:p>
+      <w:pPr>
+        <w:pStyle w:val="ListParagraph"/>
+        <w:numPr>
+          <w:ilvl w:val="1"/>
+          <w:numId w:val="2"/>
+        </w:numPr>
+      </w:pPr>
+      <w:r>
+        <w:t xml:space="preserve">The folder name changes whenever Defender updates </w:t>
+      </w:r>
+    </w:p>
+    <w:p>
+      <w:pPr>
+        <w:pStyle w:val="ListParagraph"/>
+        <w:numPr>
+          <w:ilvl w:val="1"/>
+          <w:numId w:val="2"/>
+        </w:numPr>
+        <w:rPr>
+          <w:b/>
+          <w:bCs/>
+          <w:sz w:val="28"/>
+          <w:szCs w:val="28"/>
+        </w:rPr>
+      </w:pPr>
+      <w:r>
+        <w:rPr>
+          <w:b/>
+          <w:bCs/>
+          <w:sz w:val="28"/>
+          <w:szCs w:val="28"/>
+        </w:rPr>
+        <w:t xml:space="preserve">System path: </w:t>
+      </w:r>
+    </w:p>
+    <w:p>
+      <w:pPr>
+        <w:pStyle w:val="ListParagraph"/>
+        <w:numPr>
+          <w:ilvl w:val="2"/>
+          <w:numId w:val="2"/>
+        </w:numPr>
+      </w:pPr>
+      <w:r>
+        <w:t xml:space="preserve">Unlike ping or ipconfig, Microsoft does not add the defender folder to your system’s “Path” variable by default.  </w:t>
+      </w:r>
+    </w:p>
+    <w:p/>
+    <w:p>
+      <w:pPr>
         <w:rPr>
           <w:b/>
           <w:bCs/>
@@ -62,7 +594,9 @@
           <w:u w:val="single"/>
         </w:rPr>
       </w:pPr>
-      <w:r>
+    </w:p>
+    <w:p>
+      <w:pPr>
         <w:rPr>
           <w:b/>
           <w:bCs/>
@@ -71,6 +605,102 @@
           <w:highlight w:val="yellow"/>
           <w:u w:val="single"/>
         </w:rPr>
+      </w:pPr>
+    </w:p>
+    <w:p>
+      <w:pPr>
+        <w:rPr>
+          <w:b/>
+          <w:bCs/>
+          <w:sz w:val="36"/>
+          <w:szCs w:val="36"/>
+          <w:highlight w:val="yellow"/>
+          <w:u w:val="single"/>
+        </w:rPr>
+      </w:pPr>
+    </w:p>
+    <w:p>
+      <w:pPr>
+        <w:rPr>
+          <w:b/>
+          <w:bCs/>
+          <w:sz w:val="36"/>
+          <w:szCs w:val="36"/>
+          <w:highlight w:val="yellow"/>
+          <w:u w:val="single"/>
+        </w:rPr>
+      </w:pPr>
+    </w:p>
+    <w:p>
+      <w:pPr>
+        <w:rPr>
+          <w:b/>
+          <w:bCs/>
+          <w:sz w:val="36"/>
+          <w:szCs w:val="36"/>
+          <w:u w:val="single"/>
+        </w:rPr>
+      </w:pPr>
+      <w:r>
+        <w:rPr>
+          <w:b/>
+          <w:bCs/>
+          <w:sz w:val="36"/>
+          <w:szCs w:val="36"/>
+          <w:highlight w:val="yellow"/>
+          <w:u w:val="single"/>
+        </w:rPr>
+        <w:t>Issue computer froze and then while I was restarting it, it started updating automatically, I believe it was malware:</w:t>
+      </w:r>
+      <w:r>
+        <w:rPr>
+          <w:b/>
+          <w:bCs/>
+          <w:sz w:val="36"/>
+          <w:szCs w:val="36"/>
+          <w:u w:val="single"/>
+        </w:rPr>
+        <w:t xml:space="preserve"> </w:t>
+      </w:r>
+    </w:p>
+    <w:p>
+      <w:pPr>
+        <w:pStyle w:val="ListParagraph"/>
+        <w:numPr>
+          <w:ilvl w:val="0"/>
+          <w:numId w:val="1"/>
+        </w:numPr>
+      </w:pPr>
+      <w:r>
+        <w:lastRenderedPageBreak/>
+        <w:t xml:space="preserve">It is possible that malware can disguise itself as windows updates-sometimes referred to as fake updates ransomware- it is also common for windows to trigger updates after a system freeze or crash. </w:t>
+      </w:r>
+    </w:p>
+    <w:p>
+      <w:pPr>
+        <w:pStyle w:val="ListParagraph"/>
+        <w:numPr>
+          <w:ilvl w:val="1"/>
+          <w:numId w:val="1"/>
+        </w:numPr>
+        <w:rPr>
+          <w:b/>
+          <w:bCs/>
+          <w:sz w:val="36"/>
+          <w:szCs w:val="36"/>
+          <w:highlight w:val="yellow"/>
+          <w:u w:val="single"/>
+        </w:rPr>
+      </w:pPr>
+      <w:r>
+        <w:rPr>
+          <w:b/>
+          <w:bCs/>
+          <w:sz w:val="36"/>
+          <w:szCs w:val="36"/>
+          <w:highlight w:val="yellow"/>
+          <w:u w:val="single"/>
+        </w:rPr>
         <w:t>Use command prompt (CMD) methods to manually check for suspicious processes or unauthorized remote connections:</w:t>
       </w:r>
     </w:p>
@@ -387,7 +1017,6 @@
           <w:highlight w:val="yellow"/>
           <w:u w:val="single"/>
         </w:rPr>
-        <w:lastRenderedPageBreak/>
         <w:t>Run Built-in Malware Removal Tool:</w:t>
       </w:r>
     </w:p>
@@ -428,6 +1057,7 @@
         </w:numPr>
       </w:pPr>
       <w:r>
+        <w:lastRenderedPageBreak/>
         <w:t xml:space="preserve">Launch the tool: Type, MRT in the command Prompt and press Enter. </w:t>
       </w:r>
     </w:p>
@@ -672,7 +1302,6 @@
         </w:numPr>
       </w:pPr>
       <w:r>
-        <w:lastRenderedPageBreak/>
         <w:t xml:space="preserve">The verdict:  If you do not use one of those VPNs, hydra.exe is almost certainly malware. </w:t>
       </w:r>
     </w:p>
@@ -723,6 +1352,7 @@
         </w:numPr>
       </w:pPr>
       <w:r>
+        <w:lastRenderedPageBreak/>
         <w:t xml:space="preserve">Malware frequently hides inside or mimics these standard processes to bypass firewalls: </w:t>
       </w:r>
     </w:p>
@@ -1106,72 +1736,72 @@
           <w:highlight w:val="yellow"/>
           <w:u w:val="single"/>
         </w:rPr>
+        <w:t>How to check what updates were applied by using windows command prompt:</w:t>
+      </w:r>
+    </w:p>
+    <w:p>
+      <w:pPr>
+        <w:pStyle w:val="ListParagraph"/>
+        <w:numPr>
+          <w:ilvl w:val="1"/>
+          <w:numId w:val="1"/>
+        </w:numPr>
+      </w:pPr>
+      <w:r>
+        <w:t xml:space="preserve">To check applied Windows updates via Command Prompt, you can </w:t>
+      </w:r>
+      <w:r>
+        <w:t xml:space="preserve">use the Windows Management Instrumentations Command-line WMIC, or the system information tool: </w:t>
+      </w:r>
+    </w:p>
+    <w:p>
+      <w:pPr>
+        <w:pStyle w:val="ListParagraph"/>
+        <w:numPr>
+          <w:ilvl w:val="2"/>
+          <w:numId w:val="1"/>
+        </w:numPr>
+      </w:pPr>
+      <w:r>
+        <w:t xml:space="preserve">Type, </w:t>
+      </w:r>
+      <w:r>
+        <w:rPr>
+          <w:b/>
+          <w:bCs/>
+        </w:rPr>
+        <w:t xml:space="preserve">wmic </w:t>
+      </w:r>
+      <w:proofErr w:type="spellStart"/>
+      <w:r>
+        <w:rPr>
+          <w:b/>
+          <w:bCs/>
+        </w:rPr>
+        <w:t>qfe</w:t>
+      </w:r>
+      <w:proofErr w:type="spellEnd"/>
+      <w:r>
+        <w:rPr>
+          <w:b/>
+          <w:bCs/>
+        </w:rPr>
+        <w:t xml:space="preserve"> list brief</w:t>
+      </w:r>
+      <w:r>
+        <w:t xml:space="preserve"> </w:t>
+      </w:r>
+    </w:p>
+    <w:p>
+      <w:pPr>
+        <w:pStyle w:val="ListParagraph"/>
+        <w:numPr>
+          <w:ilvl w:val="2"/>
+          <w:numId w:val="1"/>
+        </w:numPr>
+      </w:pPr>
+      <w:r>
         <w:lastRenderedPageBreak/>
-        <w:t>How to check what updates were applied by using windows command prompt:</w:t>
-      </w:r>
-    </w:p>
-    <w:p>
-      <w:pPr>
-        <w:pStyle w:val="ListParagraph"/>
-        <w:numPr>
-          <w:ilvl w:val="1"/>
-          <w:numId w:val="1"/>
-        </w:numPr>
-      </w:pPr>
-      <w:r>
-        <w:t xml:space="preserve">To check applied Windows updates via Command Prompt, you can </w:t>
-      </w:r>
-      <w:r>
-        <w:t xml:space="preserve">use the Windows Management Instrumentations Command-line WMIC, or the system information tool: </w:t>
-      </w:r>
-    </w:p>
-    <w:p>
-      <w:pPr>
-        <w:pStyle w:val="ListParagraph"/>
-        <w:numPr>
-          <w:ilvl w:val="2"/>
-          <w:numId w:val="1"/>
-        </w:numPr>
-      </w:pPr>
-      <w:r>
-        <w:t xml:space="preserve">Type, </w:t>
-      </w:r>
-      <w:r>
-        <w:rPr>
-          <w:b/>
-          <w:bCs/>
-        </w:rPr>
-        <w:t xml:space="preserve">wmic </w:t>
-      </w:r>
-      <w:proofErr w:type="spellStart"/>
-      <w:r>
-        <w:rPr>
-          <w:b/>
-          <w:bCs/>
-        </w:rPr>
-        <w:t>qfe</w:t>
-      </w:r>
-      <w:proofErr w:type="spellEnd"/>
-      <w:r>
-        <w:rPr>
-          <w:b/>
-          <w:bCs/>
-        </w:rPr>
-        <w:t xml:space="preserve"> list brief</w:t>
-      </w:r>
-      <w:r>
-        <w:t xml:space="preserve"> </w:t>
-      </w:r>
-    </w:p>
-    <w:p>
-      <w:pPr>
-        <w:pStyle w:val="ListParagraph"/>
-        <w:numPr>
-          <w:ilvl w:val="2"/>
-          <w:numId w:val="1"/>
-        </w:numPr>
-      </w:pPr>
-      <w:r>
         <w:t xml:space="preserve">With, wmic </w:t>
       </w:r>
       <w:proofErr w:type="spellStart"/>
@@ -1308,9 +1938,9 @@
 <file path=word/numbering.xml><?xml version="1.0" encoding="utf-8"?>
 <w:numbering xmlns:wpc="http://schemas.microsoft.com/office/word/2010/wordprocessingCanvas" xmlns:cx="http://schemas.microsoft.com/office/drawing/2014/chartex" xmlns:cx1="http://schemas.microsoft.com/office/drawing/2015/9/8/chartex" xmlns:cx2="http://schemas.microsoft.com/office/drawing/2015/10/21/chartex" xmlns:cx3="http://schemas.microsoft.com/office/drawing/2016/5/9/chartex" xmlns:cx4="http://schemas.microsoft.com/office/drawing/2016/5/10/chartex" xmlns:cx5="http://schemas.microsoft.com/office/drawing/2016/5/11/chartex" xmlns:cx6="http://schemas.microsoft.com/office/drawing/2016/5/12/chartex" xmlns:cx7="http://schemas.microsoft.com/office/drawing/2016/5/13/chartex" xmlns:cx8="http://schemas.microsoft.com/office/drawing/2016/5/14/chartex" xmlns:mc="http://schemas.openxmlformats.org/markup-compatibility/2006" xmlns:aink="http://schemas.microsoft.com/office/drawing/2016/ink" xmlns:am3d="http://schemas.microsoft.com/office/drawing/2017/model3d" xmlns:o="urn:schemas-microsoft-com:office:office" xmlns:oel="http://schemas.microsoft.com/office/2019/extlst" xmlns:r="http://schemas.openxmlformats.org/officeDocument/2006/relationships" xmlns:m="http://schemas.openxmlformats.org/officeDocument/2006/math" xmlns:v="urn:schemas-microsoft-com:vml" xmlns:wp14="http://schemas.microsoft.com/office/word/2010/wordprocessingDrawing" xmlns:wp="http://schemas.openxmlformats.org/drawingml/2006/wordprocessingDrawing" xmlns:w10="urn:schemas-microsoft-com:office:word" xmlns:w="http://schemas.openxmlformats.org/wordprocessingml/2006/main" xmlns:w14="http://schemas.microsoft.com/office/word/2010/wordml" xmlns:w15="http://schemas.microsoft.com/office/word/2012/wordml" xmlns:w16cex="http://schemas.microsoft.com/office/word/2018/wordml/cex" xmlns:w16cid="http://schemas.microsoft.com/office/word/2016/wordml/cid" xmlns:w16="http://schemas.microsoft.com/office/word/2018/wordml" xmlns:w16du="http://schemas.microsoft.com/office/word/2023/wordml/word16du" xmlns:w16sdtdh="http://schemas.microsoft.com/office/word/2020/wordml/sdtdatahash" xmlns:w16sdtfl="http://schemas.microsoft.com/office/word/2024/wordml/sdtformatlock" xmlns:w16se="http://schemas.microsoft.com/office/word/2015/wordml/symex" xmlns:wpg="http://schemas.microsoft.com/office/word/2010/wordprocessingGroup" xmlns:wpi="http://schemas.microsoft.com/office/word/2010/wordprocessingInk" xmlns:wne="http://schemas.microsoft.com/office/word/2006/wordml" xmlns:wps="http://schemas.microsoft.com/office/word/2010/wordprocessingShape" mc:Ignorable="w14 w15 w16se w16cid w16 w16cex w16sdtdh w16sdtfl w16du wp14">
   <w:abstractNum w:abstractNumId="0" w15:restartNumberingAfterBreak="0">
-    <w:nsid w:val="7EEB5DC2"/>
+    <w:nsid w:val="3E1909A6"/>
     <w:multiLevelType w:val="hybridMultilevel"/>
-    <w:tmpl w:val="ECD8B468"/>
+    <w:tmpl w:val="A928FF2E"/>
     <w:lvl w:ilvl="0" w:tplc="04090015">
       <w:start w:val="1"/>
       <w:numFmt w:val="upperLetter"/>
@@ -1341,6 +1971,95 @@
         <w:ind w:left="2160" w:hanging="180"/>
       </w:pPr>
     </w:lvl>
+    <w:lvl w:ilvl="3" w:tplc="0409000F" w:tentative="1">
+      <w:start w:val="1"/>
+      <w:numFmt w:val="decimal"/>
+      <w:lvlText w:val="%4."/>
+      <w:lvlJc w:val="left"/>
+      <w:pPr>
+        <w:ind w:left="2880" w:hanging="360"/>
+      </w:pPr>
+    </w:lvl>
+    <w:lvl w:ilvl="4" w:tplc="04090019" w:tentative="1">
+      <w:start w:val="1"/>
+      <w:numFmt w:val="lowerLetter"/>
+      <w:lvlText w:val="%5."/>
+      <w:lvlJc w:val="left"/>
+      <w:pPr>
+        <w:ind w:left="3600" w:hanging="360"/>
+      </w:pPr>
+    </w:lvl>
+    <w:lvl w:ilvl="5" w:tplc="0409001B" w:tentative="1">
+      <w:start w:val="1"/>
+      <w:numFmt w:val="lowerRoman"/>
+      <w:lvlText w:val="%6."/>
+      <w:lvlJc w:val="right"/>
+      <w:pPr>
+        <w:ind w:left="4320" w:hanging="180"/>
+      </w:pPr>
+    </w:lvl>
+    <w:lvl w:ilvl="6" w:tplc="0409000F" w:tentative="1">
+      <w:start w:val="1"/>
+      <w:numFmt w:val="decimal"/>
+      <w:lvlText w:val="%7."/>
+      <w:lvlJc w:val="left"/>
+      <w:pPr>
+        <w:ind w:left="5040" w:hanging="360"/>
+      </w:pPr>
+    </w:lvl>
+    <w:lvl w:ilvl="7" w:tplc="04090019" w:tentative="1">
+      <w:start w:val="1"/>
+      <w:numFmt w:val="lowerLetter"/>
+      <w:lvlText w:val="%8."/>
+      <w:lvlJc w:val="left"/>
+      <w:pPr>
+        <w:ind w:left="5760" w:hanging="360"/>
+      </w:pPr>
+    </w:lvl>
+    <w:lvl w:ilvl="8" w:tplc="0409001B" w:tentative="1">
+      <w:start w:val="1"/>
+      <w:numFmt w:val="lowerRoman"/>
+      <w:lvlText w:val="%9."/>
+      <w:lvlJc w:val="right"/>
+      <w:pPr>
+        <w:ind w:left="6480" w:hanging="180"/>
+      </w:pPr>
+    </w:lvl>
+  </w:abstractNum>
+  <w:abstractNum w:abstractNumId="1" w15:restartNumberingAfterBreak="0">
+    <w:nsid w:val="7EEB5DC2"/>
+    <w:multiLevelType w:val="hybridMultilevel"/>
+    <w:tmpl w:val="ECD8B468"/>
+    <w:lvl w:ilvl="0" w:tplc="04090015">
+      <w:start w:val="1"/>
+      <w:numFmt w:val="upperLetter"/>
+      <w:lvlText w:val="%1."/>
+      <w:lvlJc w:val="left"/>
+      <w:pPr>
+        <w:ind w:left="720" w:hanging="360"/>
+      </w:pPr>
+      <w:rPr>
+        <w:rFonts w:hint="default"/>
+      </w:rPr>
+    </w:lvl>
+    <w:lvl w:ilvl="1" w:tplc="04090019">
+      <w:start w:val="1"/>
+      <w:numFmt w:val="lowerLetter"/>
+      <w:lvlText w:val="%2."/>
+      <w:lvlJc w:val="left"/>
+      <w:pPr>
+        <w:ind w:left="1440" w:hanging="360"/>
+      </w:pPr>
+    </w:lvl>
+    <w:lvl w:ilvl="2" w:tplc="0409001B">
+      <w:start w:val="1"/>
+      <w:numFmt w:val="lowerRoman"/>
+      <w:lvlText w:val="%3."/>
+      <w:lvlJc w:val="right"/>
+      <w:pPr>
+        <w:ind w:left="2160" w:hanging="180"/>
+      </w:pPr>
+    </w:lvl>
     <w:lvl w:ilvl="3" w:tplc="0409000F">
       <w:start w:val="1"/>
       <w:numFmt w:val="decimal"/>
@@ -1397,6 +2116,9 @@
     </w:lvl>
   </w:abstractNum>
   <w:num w:numId="1" w16cid:durableId="542600589">
+    <w:abstractNumId w:val="1"/>
+  </w:num>
+  <w:num w:numId="2" w16cid:durableId="316153349">
     <w:abstractNumId w:val="0"/>
   </w:num>
 </w:numbering>

</xml_diff>